<commit_message>
docs: match report signature blocks to example
</commit_message>
<xml_diff>
--- a/Отчёты/Практика_01/Отчёт_практика_01.docx
+++ b/Отчёты/Практика_01/Отчёт_практика_01.docx
@@ -1079,20 +1079,20 @@
         <w:t>Выбран проект дневника КБЖУ, сформулированы пользовательская роль, проблема и минимальные сценарии. Консольная программа успешно собрана и запущена; штатный вывод воспроизводим, а отказ при неверном имени класса наблюдаем и понятен.</w:t>
       </w:r>
     </w:p>
-    <w:p/>
     <w:tbl>
       <w:tblPr>
+        <w:tblStyle w:val="TableGrid"/>
         <w:tblW w:type="auto" w:w="0"/>
-        <w:jc w:val="center"/>
         <w:tblLayout w:type="fixed"/>
         <w:tblLook w:firstColumn="1" w:firstRow="1" w:lastColumn="0" w:lastRow="0" w:noHBand="0" w:noVBand="1" w:val="04A0"/>
+        <w:jc w:val="center"/>
         <w:tblBorders>
-          <w:top w:val="nil"/>
-          <w:left w:val="nil"/>
-          <w:bottom w:val="nil"/>
-          <w:right w:val="nil"/>
-          <w:insideH w:val="nil"/>
-          <w:insideV w:val="nil"/>
+          <w:top w:val="single" w:sz="6" w:space="0" w:color="000000"/>
+          <w:left w:val="single" w:sz="6" w:space="0" w:color="000000"/>
+          <w:bottom w:val="single" w:sz="6" w:space="0" w:color="000000"/>
+          <w:right w:val="single" w:sz="6" w:space="0" w:color="000000"/>
+          <w:insideH w:val="single" w:sz="6" w:space="0" w:color="000000"/>
+          <w:insideV w:val="single" w:sz="6" w:space="0" w:color="000000"/>
         </w:tblBorders>
       </w:tblPr>
       <w:tblGrid>
@@ -1100,61 +1100,74 @@
         <w:gridCol w:w="4677"/>
       </w:tblGrid>
       <w:tr>
+        <w:trPr>
+          <w:trHeight w:val="879" w:hRule="atLeast"/>
+        </w:trPr>
         <w:tc>
           <w:tcPr>
-            <w:tcW w:type="dxa" w:w="4479"/>
+            <w:tcW w:type="dxa" w:w="4394"/>
+            <w:vAlign w:val="center"/>
             <w:tcMar>
-              <w:top w:w="110" w:type="dxa"/>
-              <w:start w:w="110" w:type="dxa"/>
-              <w:bottom w:w="110" w:type="dxa"/>
-              <w:end w:w="110" w:type="dxa"/>
+              <w:top w:w="70" w:type="dxa"/>
+              <w:start w:w="100" w:type="dxa"/>
+              <w:bottom w:w="70" w:type="dxa"/>
+              <w:end w:w="100" w:type="dxa"/>
             </w:tcMar>
           </w:tcPr>
           <w:p>
             <w:pPr>
-              <w:keepLines w:val="0"/>
+              <w:keepLines/>
               <w:spacing w:line="360" w:lineRule="auto" w:before="0" w:after="0"/>
-              <w:ind w:firstLine="0"/>
+              <w:ind w:firstLine="0" w:left="0" w:right="0"/>
+              <w:jc w:val="left"/>
+            </w:pPr>
+            <w:r/>
+            <w:r>
+              <w:rPr>
+                <w:rFonts w:ascii="Times New Roman" w:hAnsi="Times New Roman" w:eastAsia="Times New Roman" w:cs="Times New Roman"/>
+                <w:sz w:val="28"/>
+              </w:rPr>
+              <w:t>Выполнил: студент группы</w:t>
+            </w:r>
+          </w:p>
+          <w:p>
+            <w:pPr>
+              <w:keepLines/>
+              <w:spacing w:line="360" w:lineRule="auto" w:before="0" w:after="0"/>
+              <w:ind w:firstLine="0" w:left="0" w:right="0"/>
               <w:jc w:val="left"/>
             </w:pPr>
             <w:r>
               <w:rPr>
                 <w:rFonts w:ascii="Times New Roman" w:hAnsi="Times New Roman" w:eastAsia="Times New Roman" w:cs="Times New Roman"/>
-                <w:b w:val="0"/>
-                <w:i w:val="0"/>
-                <w:color w:val="000000"/>
                 <w:sz w:val="28"/>
               </w:rPr>
-              <w:t>Студент группы 090302-ИСТа-023</w:t>
+              <w:t>090302-ИСТа-023</w:t>
             </w:r>
           </w:p>
         </w:tc>
         <w:tc>
           <w:tcPr>
-            <w:tcW w:type="dxa" w:w="4479"/>
+            <w:tcW w:type="dxa" w:w="4394"/>
+            <w:vAlign w:val="center"/>
             <w:tcMar>
-              <w:top w:w="110" w:type="dxa"/>
-              <w:start w:w="110" w:type="dxa"/>
-              <w:bottom w:w="110" w:type="dxa"/>
-              <w:end w:w="110" w:type="dxa"/>
+              <w:top w:w="70" w:type="dxa"/>
+              <w:start w:w="100" w:type="dxa"/>
+              <w:bottom w:w="70" w:type="dxa"/>
+              <w:end w:w="100" w:type="dxa"/>
             </w:tcMar>
-            <w:tcBorders>
-              <w:bottom w:val="single" w:sz="6" w:color="000000"/>
-            </w:tcBorders>
           </w:tcPr>
           <w:p>
             <w:pPr>
-              <w:keepLines w:val="0"/>
+              <w:keepLines/>
               <w:spacing w:line="360" w:lineRule="auto" w:before="0" w:after="0"/>
-              <w:ind w:firstLine="0"/>
-              <w:jc w:val="center"/>
+              <w:ind w:firstLine="0" w:left="0" w:right="0"/>
+              <w:jc w:val="left"/>
             </w:pPr>
+            <w:r/>
             <w:r>
               <w:rPr>
                 <w:rFonts w:ascii="Times New Roman" w:hAnsi="Times New Roman" w:eastAsia="Times New Roman" w:cs="Times New Roman"/>
-                <w:b w:val="0"/>
-                <w:i w:val="0"/>
-                <w:color w:val="000000"/>
                 <w:sz w:val="28"/>
               </w:rPr>
               <w:t>Карионов В.В.</w:t>
@@ -1163,61 +1176,59 @@
         </w:tc>
       </w:tr>
       <w:tr>
+        <w:trPr>
+          <w:trHeight w:val="482" w:hRule="atLeast"/>
+        </w:trPr>
         <w:tc>
           <w:tcPr>
-            <w:tcW w:type="dxa" w:w="4479"/>
+            <w:tcW w:type="dxa" w:w="4394"/>
+            <w:vAlign w:val="center"/>
             <w:tcMar>
-              <w:top w:w="110" w:type="dxa"/>
-              <w:start w:w="110" w:type="dxa"/>
-              <w:bottom w:w="110" w:type="dxa"/>
-              <w:end w:w="110" w:type="dxa"/>
+              <w:top w:w="70" w:type="dxa"/>
+              <w:start w:w="100" w:type="dxa"/>
+              <w:bottom w:w="70" w:type="dxa"/>
+              <w:end w:w="100" w:type="dxa"/>
             </w:tcMar>
           </w:tcPr>
           <w:p>
             <w:pPr>
-              <w:keepLines w:val="0"/>
+              <w:keepLines/>
               <w:spacing w:line="360" w:lineRule="auto" w:before="0" w:after="0"/>
-              <w:ind w:firstLine="0"/>
+              <w:ind w:firstLine="0" w:left="0" w:right="0"/>
               <w:jc w:val="left"/>
             </w:pPr>
+            <w:r/>
             <w:r>
               <w:rPr>
                 <w:rFonts w:ascii="Times New Roman" w:hAnsi="Times New Roman" w:eastAsia="Times New Roman" w:cs="Times New Roman"/>
-                <w:b w:val="0"/>
-                <w:i w:val="0"/>
-                <w:color w:val="000000"/>
                 <w:sz w:val="28"/>
               </w:rPr>
-              <w:t>Преподаватель</w:t>
+              <w:t>Проверил: преподаватель</w:t>
             </w:r>
           </w:p>
         </w:tc>
         <w:tc>
           <w:tcPr>
-            <w:tcW w:type="dxa" w:w="4479"/>
+            <w:tcW w:type="dxa" w:w="4394"/>
+            <w:vAlign w:val="center"/>
             <w:tcMar>
-              <w:top w:w="110" w:type="dxa"/>
-              <w:start w:w="110" w:type="dxa"/>
-              <w:bottom w:w="110" w:type="dxa"/>
-              <w:end w:w="110" w:type="dxa"/>
+              <w:top w:w="70" w:type="dxa"/>
+              <w:start w:w="100" w:type="dxa"/>
+              <w:bottom w:w="70" w:type="dxa"/>
+              <w:end w:w="100" w:type="dxa"/>
             </w:tcMar>
-            <w:tcBorders>
-              <w:bottom w:val="single" w:sz="6" w:color="000000"/>
-            </w:tcBorders>
           </w:tcPr>
           <w:p>
             <w:pPr>
-              <w:keepLines w:val="0"/>
+              <w:keepLines/>
               <w:spacing w:line="360" w:lineRule="auto" w:before="0" w:after="0"/>
-              <w:ind w:firstLine="0"/>
-              <w:jc w:val="center"/>
+              <w:ind w:firstLine="0" w:left="0" w:right="0"/>
+              <w:jc w:val="left"/>
             </w:pPr>
+            <w:r/>
             <w:r>
               <w:rPr>
                 <w:rFonts w:ascii="Times New Roman" w:hAnsi="Times New Roman" w:eastAsia="Times New Roman" w:cs="Times New Roman"/>
-                <w:b w:val="0"/>
-                <w:i w:val="0"/>
-                <w:color w:val="000000"/>
                 <w:sz w:val="28"/>
               </w:rPr>
               <w:t>Елкин Н.С.</w:t>

</xml_diff>